<commit_message>
Updated Project Phase 1.docx
I just finished my Task 2 listing all the functional and non-functional requirements for my flight booking system. I did trace already my stakeholders to my requirements. I've started and still finalising my use case diagram and starting 04/13 i'll be document everything in my report file.
</commit_message>
<xml_diff>
--- a/Project Phase 1.docx
+++ b/Project Phase 1.docx
@@ -508,13 +508,23 @@
           <w:lang w:val="en-US"/>
         </w:rPr>
       </w:pPr>
-      <w:r>
-        <w:rPr>
-          <w:sz w:val="26"/>
-          <w:szCs w:val="26"/>
-          <w:lang w:val="en-US"/>
-        </w:rPr>
-        <w:t>Remove Flights</w:t>
+      <w:proofErr w:type="gramStart"/>
+      <w:r>
+        <w:rPr>
+          <w:sz w:val="26"/>
+          <w:szCs w:val="26"/>
+          <w:lang w:val="en-US"/>
+        </w:rPr>
+        <w:t>Remove</w:t>
+      </w:r>
+      <w:proofErr w:type="gramEnd"/>
+      <w:r>
+        <w:rPr>
+          <w:sz w:val="26"/>
+          <w:szCs w:val="26"/>
+          <w:lang w:val="en-US"/>
+        </w:rPr>
+        <w:t xml:space="preserve"> Flights</w:t>
       </w:r>
     </w:p>
     <w:p>
@@ -595,13 +605,23 @@
           <w:lang w:val="en-US"/>
         </w:rPr>
       </w:pPr>
-      <w:r>
-        <w:rPr>
-          <w:sz w:val="26"/>
-          <w:szCs w:val="26"/>
-          <w:lang w:val="en-US"/>
-        </w:rPr>
-        <w:t>Search Flights</w:t>
+      <w:proofErr w:type="gramStart"/>
+      <w:r>
+        <w:rPr>
+          <w:sz w:val="26"/>
+          <w:szCs w:val="26"/>
+          <w:lang w:val="en-US"/>
+        </w:rPr>
+        <w:t>Search</w:t>
+      </w:r>
+      <w:proofErr w:type="gramEnd"/>
+      <w:r>
+        <w:rPr>
+          <w:sz w:val="26"/>
+          <w:szCs w:val="26"/>
+          <w:lang w:val="en-US"/>
+        </w:rPr>
+        <w:t xml:space="preserve"> Flights</w:t>
       </w:r>
     </w:p>
     <w:p>
@@ -728,13 +748,23 @@
           <w:lang w:val="en-US"/>
         </w:rPr>
       </w:pPr>
-      <w:r>
-        <w:rPr>
-          <w:sz w:val="26"/>
-          <w:szCs w:val="26"/>
-          <w:lang w:val="en-US"/>
-        </w:rPr>
-        <w:t>Search Flights</w:t>
+      <w:proofErr w:type="gramStart"/>
+      <w:r>
+        <w:rPr>
+          <w:sz w:val="26"/>
+          <w:szCs w:val="26"/>
+          <w:lang w:val="en-US"/>
+        </w:rPr>
+        <w:t>Search</w:t>
+      </w:r>
+      <w:proofErr w:type="gramEnd"/>
+      <w:r>
+        <w:rPr>
+          <w:sz w:val="26"/>
+          <w:szCs w:val="26"/>
+          <w:lang w:val="en-US"/>
+        </w:rPr>
+        <w:t xml:space="preserve"> Flights</w:t>
       </w:r>
     </w:p>
     <w:p>
@@ -883,7 +913,6 @@
           </w:placeholder>
           <w15:appearance w15:val="hidden"/>
         </w:sdtPr>
-        <w:sdtEndPr/>
         <w:sdtContent>
           <w:r>
             <w:rPr>
@@ -919,7 +948,6 @@
           </w:placeholder>
           <w15:appearance w15:val="hidden"/>
         </w:sdtPr>
-        <w:sdtEndPr/>
         <w:sdtContent>
           <w:r>
             <w:rPr>
@@ -955,7 +983,6 @@
           </w:placeholder>
           <w15:appearance w15:val="hidden"/>
         </w:sdtPr>
-        <w:sdtEndPr/>
         <w:sdtContent>
           <w:r>
             <w:rPr>
@@ -991,7 +1018,6 @@
           </w:placeholder>
           <w15:appearance w15:val="hidden"/>
         </w:sdtPr>
-        <w:sdtEndPr/>
         <w:sdtContent>
           <w:r>
             <w:rPr>
@@ -1027,7 +1053,6 @@
           </w:placeholder>
           <w15:appearance w15:val="hidden"/>
         </w:sdtPr>
-        <w:sdtEndPr/>
         <w:sdtContent>
           <w:r>
             <w:rPr>
@@ -1063,7 +1088,6 @@
           </w:placeholder>
           <w15:appearance w15:val="hidden"/>
         </w:sdtPr>
-        <w:sdtEndPr/>
         <w:sdtContent>
           <w:r>
             <w:rPr>
@@ -1137,7 +1161,6 @@
           </w:placeholder>
           <w15:appearance w15:val="hidden"/>
         </w:sdtPr>
-        <w:sdtEndPr/>
         <w:sdtContent>
           <w:r>
             <w:rPr>
@@ -1173,7 +1196,6 @@
           </w:placeholder>
           <w15:appearance w15:val="hidden"/>
         </w:sdtPr>
-        <w:sdtEndPr/>
         <w:sdtContent>
           <w:r>
             <w:rPr>
@@ -1209,7 +1231,6 @@
           </w:placeholder>
           <w15:appearance w15:val="hidden"/>
         </w:sdtPr>
-        <w:sdtEndPr/>
         <w:sdtContent>
           <w:r>
             <w:rPr>
@@ -1245,7 +1266,6 @@
           </w:placeholder>
           <w15:appearance w15:val="hidden"/>
         </w:sdtPr>
-        <w:sdtEndPr/>
         <w:sdtContent>
           <w:r>
             <w:rPr>
@@ -1281,7 +1301,6 @@
           </w:placeholder>
           <w15:appearance w15:val="hidden"/>
         </w:sdtPr>
-        <w:sdtEndPr/>
         <w:sdtContent>
           <w:r>
             <w:rPr>
@@ -1337,7 +1356,6 @@
           </w:placeholder>
           <w15:appearance w15:val="hidden"/>
         </w:sdtPr>
-        <w:sdtEndPr/>
         <w:sdtContent>
           <w:r>
             <w:rPr>
@@ -2951,7 +2969,6 @@
         </w:placeholder>
         <w15:appearance w15:val="hidden"/>
       </w:sdtPr>
-      <w:sdtEndPr/>
       <w:sdtContent>
         <w:p>
           <w:pPr>
@@ -3038,7 +3055,6 @@
         </w:placeholder>
         <w15:appearance w15:val="hidden"/>
       </w:sdtPr>
-      <w:sdtEndPr/>
       <w:sdtContent>
         <w:p>
           <w:pPr>
@@ -4475,15 +4491,27 @@
           <w:lang w:val="en-US"/>
         </w:rPr>
       </w:pPr>
-      <w:r>
-        <w:rPr>
-          <w:b/>
-          <w:bCs/>
-          <w:sz w:val="26"/>
-          <w:szCs w:val="26"/>
-          <w:lang w:val="en-US"/>
-        </w:rPr>
-        <w:t>Environment Assumptions</w:t>
+      <w:proofErr w:type="gramStart"/>
+      <w:r>
+        <w:rPr>
+          <w:b/>
+          <w:bCs/>
+          <w:sz w:val="26"/>
+          <w:szCs w:val="26"/>
+          <w:lang w:val="en-US"/>
+        </w:rPr>
+        <w:t>Environment</w:t>
+      </w:r>
+      <w:proofErr w:type="gramEnd"/>
+      <w:r>
+        <w:rPr>
+          <w:b/>
+          <w:bCs/>
+          <w:sz w:val="26"/>
+          <w:szCs w:val="26"/>
+          <w:lang w:val="en-US"/>
+        </w:rPr>
+        <w:t xml:space="preserve"> Assumptions</w:t>
       </w:r>
     </w:p>
     <w:p>
@@ -5589,7 +5617,25 @@
           <w:szCs w:val="26"/>
           <w:lang w:val="en-US"/>
         </w:rPr>
-        <w:t>The system shall validate that the number of seats requested does not exceed the available seats.</w:t>
+        <w:t xml:space="preserve">The system </w:t>
+      </w:r>
+      <w:proofErr w:type="gramStart"/>
+      <w:r>
+        <w:rPr>
+          <w:sz w:val="26"/>
+          <w:szCs w:val="26"/>
+          <w:lang w:val="en-US"/>
+        </w:rPr>
+        <w:t>shall</w:t>
+      </w:r>
+      <w:proofErr w:type="gramEnd"/>
+      <w:r>
+        <w:rPr>
+          <w:sz w:val="26"/>
+          <w:szCs w:val="26"/>
+          <w:lang w:val="en-US"/>
+        </w:rPr>
+        <w:t xml:space="preserve"> validate that the number of seats requested does not exceed the available seats.</w:t>
       </w:r>
     </w:p>
     <w:p>
@@ -5713,15 +5759,43 @@
           <w:szCs w:val="26"/>
           <w:lang w:val="en-US"/>
         </w:rPr>
-        <w:t xml:space="preserve">: </w:t>
-      </w:r>
-      <w:r>
-        <w:rPr>
-          <w:sz w:val="26"/>
-          <w:szCs w:val="26"/>
-          <w:lang w:val="en-US"/>
-        </w:rPr>
-        <w:t>The system shall update the number of booked seats after each booking or cancellation.</w:t>
+        <w:t xml:space="preserve">: The system </w:t>
+      </w:r>
+      <w:proofErr w:type="gramStart"/>
+      <w:r>
+        <w:rPr>
+          <w:sz w:val="26"/>
+          <w:szCs w:val="26"/>
+          <w:lang w:val="en-US"/>
+        </w:rPr>
+        <w:t>shall</w:t>
+      </w:r>
+      <w:proofErr w:type="gramEnd"/>
+      <w:r>
+        <w:rPr>
+          <w:sz w:val="26"/>
+          <w:szCs w:val="26"/>
+          <w:lang w:val="en-US"/>
+        </w:rPr>
+        <w:t xml:space="preserve"> update the number of </w:t>
+      </w:r>
+      <w:proofErr w:type="gramStart"/>
+      <w:r>
+        <w:rPr>
+          <w:sz w:val="26"/>
+          <w:szCs w:val="26"/>
+          <w:lang w:val="en-US"/>
+        </w:rPr>
+        <w:t>booked seats</w:t>
+      </w:r>
+      <w:proofErr w:type="gramEnd"/>
+      <w:r>
+        <w:rPr>
+          <w:sz w:val="26"/>
+          <w:szCs w:val="26"/>
+          <w:lang w:val="en-US"/>
+        </w:rPr>
+        <w:t xml:space="preserve"> after each booking or cancellation.</w:t>
       </w:r>
     </w:p>
     <w:p>
@@ -6783,7 +6857,25 @@
           <w:szCs w:val="26"/>
           <w:lang w:val="en-US"/>
         </w:rPr>
-        <w:t xml:space="preserve"> The system shall not require an internet connection to function.</w:t>
+        <w:t xml:space="preserve"> The system </w:t>
+      </w:r>
+      <w:proofErr w:type="gramStart"/>
+      <w:r>
+        <w:rPr>
+          <w:sz w:val="26"/>
+          <w:szCs w:val="26"/>
+          <w:lang w:val="en-US"/>
+        </w:rPr>
+        <w:t>shall</w:t>
+      </w:r>
+      <w:proofErr w:type="gramEnd"/>
+      <w:r>
+        <w:rPr>
+          <w:sz w:val="26"/>
+          <w:szCs w:val="26"/>
+          <w:lang w:val="en-US"/>
+        </w:rPr>
+        <w:t xml:space="preserve"> not require an internet connection to function.</w:t>
       </w:r>
     </w:p>
     <w:p>
@@ -7891,6 +7983,14 @@
                 <w:lang w:val="en-US"/>
               </w:rPr>
             </w:pPr>
+            <w:r>
+              <w:rPr>
+                <w:sz w:val="26"/>
+                <w:szCs w:val="26"/>
+                <w:lang w:val="en-US"/>
+              </w:rPr>
+              <w:t>NFR1, NFR2, NFR3, NFR4, NFR5, NFR6, NFR7, NFR8, NFR9, NFR10, NFR11, NFR12, NFR13, NFR14, NFR15, NFR16, NFR17, NFR18, NFR19, NFR24, NFR25, NFR26, NFR27, NFR28, NFR29, NFR30, NFR31</w:t>
+            </w:r>
           </w:p>
         </w:tc>
       </w:tr>
@@ -7929,6 +8029,14 @@
                 <w:lang w:val="en-US"/>
               </w:rPr>
             </w:pPr>
+            <w:r>
+              <w:rPr>
+                <w:sz w:val="26"/>
+                <w:szCs w:val="26"/>
+                <w:lang w:val="en-US"/>
+              </w:rPr>
+              <w:t>NFR1, NFR2, NFR4, NFR5, NFR6, NFR7, NFR8, NFR9, NFR10, NFR11, NFR12, NFR13, NFR14, NFR15, NFR16, NFR17, NFR18, NFR23, NFR24, NFR25, NFR26, NFR29, NFR30, NFR31</w:t>
+            </w:r>
           </w:p>
         </w:tc>
       </w:tr>
@@ -7967,6 +8075,22 @@
                 <w:lang w:val="en-US"/>
               </w:rPr>
             </w:pPr>
+            <w:r>
+              <w:rPr>
+                <w:sz w:val="26"/>
+                <w:szCs w:val="26"/>
+                <w:lang w:val="en-US"/>
+              </w:rPr>
+              <w:t>NFR1, NFR2, NFR4, NFR7, NFR8, NFR9, NFR10, NFR11, NFR12, NFR13, NFR14, NFR15</w:t>
+            </w:r>
+            <w:r>
+              <w:rPr>
+                <w:sz w:val="26"/>
+                <w:szCs w:val="26"/>
+                <w:lang w:val="en-US"/>
+              </w:rPr>
+              <w:t>, NFR24, NFR25, NFR26, NFR30, NFR31</w:t>
+            </w:r>
           </w:p>
         </w:tc>
       </w:tr>
@@ -8005,6 +8129,23 @@
                 <w:lang w:val="en-US"/>
               </w:rPr>
             </w:pPr>
+            <w:r>
+              <w:rPr>
+                <w:sz w:val="26"/>
+                <w:szCs w:val="26"/>
+                <w:lang w:val="en-US"/>
+              </w:rPr>
+              <w:t xml:space="preserve">NFR1, NFR2, NFR3, NFR4, NFR5, NFR6, NFR7, NFR8, NFR16, NFR17, NFR18, NFR19, NFR20, NFR21, </w:t>
+            </w:r>
+            <w:r>
+              <w:rPr>
+                <w:sz w:val="26"/>
+                <w:szCs w:val="26"/>
+                <w:lang w:val="en-US"/>
+              </w:rPr>
+              <w:lastRenderedPageBreak/>
+              <w:t>NFR22, NFR23, NFR24, NFR25, NFR26, NFR27, NFR28, NFR29, NFR30, NFR31</w:t>
+            </w:r>
           </w:p>
         </w:tc>
       </w:tr>
@@ -8027,6 +8168,7 @@
                 <w:szCs w:val="26"/>
                 <w:lang w:val="en-US"/>
               </w:rPr>
+              <w:lastRenderedPageBreak/>
               <w:t>Airline Management</w:t>
             </w:r>
           </w:p>
@@ -8043,6 +8185,14 @@
                 <w:lang w:val="en-US"/>
               </w:rPr>
             </w:pPr>
+            <w:r>
+              <w:rPr>
+                <w:sz w:val="26"/>
+                <w:szCs w:val="26"/>
+                <w:lang w:val="en-US"/>
+              </w:rPr>
+              <w:t>NFR4, NFR5, NFR6, NFR23, NFR27, NFR28, NFR29</w:t>
+            </w:r>
           </w:p>
         </w:tc>
       </w:tr>
@@ -8081,10 +8231,239 @@
                 <w:lang w:val="en-US"/>
               </w:rPr>
             </w:pPr>
+            <w:r>
+              <w:rPr>
+                <w:sz w:val="26"/>
+                <w:szCs w:val="26"/>
+                <w:lang w:val="en-US"/>
+              </w:rPr>
+              <w:t>NFR1, NFR2, NFR3, NFR4, NFR5, NFR6, NFR7, NFR8, NFR9, NFR10, NFR11, NFR16, NFR17, NFR18, NFR19, NFR20, NFR21, NFR23, NFR24, NFR25, NFR26, NFR29, NFR30, NFR31, NFR32</w:t>
+            </w:r>
           </w:p>
         </w:tc>
       </w:tr>
     </w:tbl>
+    <w:p>
+      <w:pPr>
+        <w:rPr>
+          <w:b/>
+          <w:bCs/>
+          <w:sz w:val="30"/>
+          <w:szCs w:val="30"/>
+          <w:lang w:val="en-US"/>
+        </w:rPr>
+      </w:pPr>
+    </w:p>
+    <w:p>
+      <w:pPr>
+        <w:rPr>
+          <w:b/>
+          <w:bCs/>
+          <w:sz w:val="30"/>
+          <w:szCs w:val="30"/>
+          <w:lang w:val="en-US"/>
+        </w:rPr>
+      </w:pPr>
+    </w:p>
+    <w:p>
+      <w:pPr>
+        <w:rPr>
+          <w:b/>
+          <w:bCs/>
+          <w:sz w:val="30"/>
+          <w:szCs w:val="30"/>
+          <w:lang w:val="en-US"/>
+        </w:rPr>
+      </w:pPr>
+    </w:p>
+    <w:p>
+      <w:pPr>
+        <w:rPr>
+          <w:b/>
+          <w:bCs/>
+          <w:sz w:val="30"/>
+          <w:szCs w:val="30"/>
+          <w:lang w:val="en-US"/>
+        </w:rPr>
+      </w:pPr>
+    </w:p>
+    <w:p>
+      <w:pPr>
+        <w:rPr>
+          <w:b/>
+          <w:bCs/>
+          <w:sz w:val="30"/>
+          <w:szCs w:val="30"/>
+          <w:lang w:val="en-US"/>
+        </w:rPr>
+      </w:pPr>
+    </w:p>
+    <w:p>
+      <w:pPr>
+        <w:rPr>
+          <w:b/>
+          <w:bCs/>
+          <w:sz w:val="30"/>
+          <w:szCs w:val="30"/>
+          <w:lang w:val="en-US"/>
+        </w:rPr>
+      </w:pPr>
+    </w:p>
+    <w:p>
+      <w:pPr>
+        <w:rPr>
+          <w:b/>
+          <w:bCs/>
+          <w:sz w:val="30"/>
+          <w:szCs w:val="30"/>
+          <w:lang w:val="en-US"/>
+        </w:rPr>
+      </w:pPr>
+    </w:p>
+    <w:p>
+      <w:pPr>
+        <w:rPr>
+          <w:b/>
+          <w:bCs/>
+          <w:sz w:val="30"/>
+          <w:szCs w:val="30"/>
+          <w:lang w:val="en-US"/>
+        </w:rPr>
+      </w:pPr>
+    </w:p>
+    <w:p>
+      <w:pPr>
+        <w:rPr>
+          <w:b/>
+          <w:bCs/>
+          <w:sz w:val="30"/>
+          <w:szCs w:val="30"/>
+          <w:lang w:val="en-US"/>
+        </w:rPr>
+      </w:pPr>
+    </w:p>
+    <w:p>
+      <w:pPr>
+        <w:rPr>
+          <w:b/>
+          <w:bCs/>
+          <w:sz w:val="30"/>
+          <w:szCs w:val="30"/>
+          <w:lang w:val="en-US"/>
+        </w:rPr>
+      </w:pPr>
+    </w:p>
+    <w:p>
+      <w:pPr>
+        <w:rPr>
+          <w:b/>
+          <w:bCs/>
+          <w:sz w:val="30"/>
+          <w:szCs w:val="30"/>
+          <w:lang w:val="en-US"/>
+        </w:rPr>
+      </w:pPr>
+    </w:p>
+    <w:p>
+      <w:pPr>
+        <w:rPr>
+          <w:b/>
+          <w:bCs/>
+          <w:sz w:val="30"/>
+          <w:szCs w:val="30"/>
+          <w:lang w:val="en-US"/>
+        </w:rPr>
+      </w:pPr>
+    </w:p>
+    <w:p>
+      <w:pPr>
+        <w:rPr>
+          <w:b/>
+          <w:bCs/>
+          <w:sz w:val="30"/>
+          <w:szCs w:val="30"/>
+          <w:lang w:val="en-US"/>
+        </w:rPr>
+      </w:pPr>
+    </w:p>
+    <w:p>
+      <w:pPr>
+        <w:rPr>
+          <w:b/>
+          <w:bCs/>
+          <w:sz w:val="30"/>
+          <w:szCs w:val="30"/>
+          <w:lang w:val="en-US"/>
+        </w:rPr>
+      </w:pPr>
+    </w:p>
+    <w:p>
+      <w:pPr>
+        <w:rPr>
+          <w:b/>
+          <w:bCs/>
+          <w:sz w:val="30"/>
+          <w:szCs w:val="30"/>
+          <w:lang w:val="en-US"/>
+        </w:rPr>
+      </w:pPr>
+    </w:p>
+    <w:p>
+      <w:pPr>
+        <w:rPr>
+          <w:b/>
+          <w:bCs/>
+          <w:sz w:val="30"/>
+          <w:szCs w:val="30"/>
+          <w:lang w:val="en-US"/>
+        </w:rPr>
+      </w:pPr>
+    </w:p>
+    <w:p>
+      <w:pPr>
+        <w:rPr>
+          <w:b/>
+          <w:bCs/>
+          <w:sz w:val="30"/>
+          <w:szCs w:val="30"/>
+          <w:lang w:val="en-US"/>
+        </w:rPr>
+      </w:pPr>
+    </w:p>
+    <w:p>
+      <w:pPr>
+        <w:rPr>
+          <w:b/>
+          <w:bCs/>
+          <w:sz w:val="30"/>
+          <w:szCs w:val="30"/>
+          <w:lang w:val="en-US"/>
+        </w:rPr>
+      </w:pPr>
+    </w:p>
+    <w:p>
+      <w:pPr>
+        <w:jc w:val="center"/>
+        <w:rPr>
+          <w:b/>
+          <w:bCs/>
+          <w:sz w:val="30"/>
+          <w:szCs w:val="30"/>
+          <w:lang w:val="en-US"/>
+        </w:rPr>
+      </w:pPr>
+      <w:r>
+        <w:rPr>
+          <w:b/>
+          <w:bCs/>
+          <w:sz w:val="30"/>
+          <w:szCs w:val="30"/>
+          <w:lang w:val="en-US"/>
+        </w:rPr>
+        <w:lastRenderedPageBreak/>
+        <w:t>Task 3: UML Requirements Modelling</w:t>
+      </w:r>
+    </w:p>
     <w:p>
       <w:pPr>
         <w:rPr>
@@ -8355,7 +8734,6 @@
         </w:placeholder>
         <w15:appearance w15:val="hidden"/>
       </w:sdtPr>
-      <w:sdtEndPr/>
       <w:sdtContent>
         <w:p>
           <w:pPr>
@@ -10326,6 +10704,7 @@
   <w:style w:type="character" w:default="1" w:styleId="DefaultParagraphFont">
     <w:name w:val="Default Paragraph Font"/>
     <w:uiPriority w:val="1"/>
+    <w:semiHidden/>
     <w:unhideWhenUsed/>
   </w:style>
   <w:style w:type="table" w:default="1" w:styleId="TableNormal">
@@ -10790,9 +11169,11 @@
     <w:rsidRoot w:val="00C43B6E"/>
     <w:rsid w:val="00117259"/>
     <w:rsid w:val="002A5B84"/>
+    <w:rsid w:val="00436684"/>
     <w:rsid w:val="00BD6B70"/>
     <w:rsid w:val="00C43B6E"/>
     <w:rsid w:val="00E5238B"/>
+    <w:rsid w:val="00F50D89"/>
     <w:rsid w:val="00FD40E7"/>
   </w:rsids>
   <m:mathPr>

</xml_diff>